<commit_message>
Adjusted overview for firmed booked and waitlisted, added an aditional Button to request helpers and drivers for events, added a search function to manualy add drivers and helpers as eventmanager or admin
</commit_message>
<xml_diff>
--- a/wwwroot/configsheets/Informationen/Sponsoren.docx
+++ b/wwwroot/configsheets/Informationen/Sponsoren.docx
@@ -1,6 +1,6 @@
 
 <file path=word/document.xml><?xml version="1.0" encoding="utf-8"?>
-<w:document xmlns:wpc="http://schemas.microsoft.com/office/word/2010/wordprocessingCanvas" xmlns:cx="http://schemas.microsoft.com/office/drawing/2014/chartex" xmlns:cx1="http://schemas.microsoft.com/office/drawing/2015/9/8/chartex" xmlns:cx2="http://schemas.microsoft.com/office/drawing/2015/10/21/chartex" xmlns:cx3="http://schemas.microsoft.com/office/drawing/2016/5/9/chartex" xmlns:cx4="http://schemas.microsoft.com/office/drawing/2016/5/10/chartex" xmlns:cx5="http://schemas.microsoft.com/office/drawing/2016/5/11/chartex" xmlns:cx6="http://schemas.microsoft.com/office/drawing/2016/5/12/chartex" xmlns:cx7="http://schemas.microsoft.com/office/drawing/2016/5/13/chartex" xmlns:cx8="http://schemas.microsoft.com/office/drawing/2016/5/14/chartex" xmlns:mc="http://schemas.openxmlformats.org/markup-compatibility/2006" xmlns:aink="http://schemas.microsoft.com/office/drawing/2016/ink" xmlns:am3d="http://schemas.microsoft.com/office/drawing/2017/model3d" xmlns:o="urn:schemas-microsoft-com:office:office" xmlns:oel="http://schemas.microsoft.com/office/2019/extlst" xmlns:r="http://schemas.openxmlformats.org/officeDocument/2006/relationships" xmlns:m="http://schemas.openxmlformats.org/officeDocument/2006/math" xmlns:v="urn:schemas-microsoft-com:vml" xmlns:wp14="http://schemas.microsoft.com/office/word/2010/wordprocessingDrawing" xmlns:wp="http://schemas.openxmlformats.org/drawingml/2006/wordprocessingDrawing" xmlns:w10="urn:schemas-microsoft-com:office:word" xmlns:w="http://schemas.openxmlformats.org/wordprocessingml/2006/main" xmlns:w14="http://schemas.microsoft.com/office/word/2010/wordml" xmlns:w15="http://schemas.microsoft.com/office/word/2012/wordml" xmlns:w16cei="http://schemas.microsoft.com/office/word/2026/wordml/cei" xmlns:w16cex="http://schemas.microsoft.com/office/word/2018/wordml/cex" xmlns:w16cid="http://schemas.microsoft.com/office/word/2016/wordml/cid" xmlns:w16="http://schemas.microsoft.com/office/word/2018/wordml" xmlns:w16du="http://schemas.microsoft.com/office/word/2023/wordml/word16du" xmlns:w16sdtdh="http://schemas.microsoft.com/office/word/2020/wordml/sdtdatahash" xmlns:w16sdtfl="http://schemas.microsoft.com/office/word/2024/wordml/sdtformatlock" xmlns:w16se="http://schemas.microsoft.com/office/word/2015/wordml/symex" xmlns:wpg="http://schemas.microsoft.com/office/word/2010/wordprocessingGroup" xmlns:wpi="http://schemas.microsoft.com/office/word/2010/wordprocessingInk" xmlns:wne="http://schemas.microsoft.com/office/word/2006/wordml" xmlns:wps="http://schemas.microsoft.com/office/word/2010/wordprocessingShape" mc:Ignorable="w14 w15 w16se w16cid w16 w16cex w16sdtdh w16sdtfl w16du wp14">
+<w:document xmlns:wpc="http://schemas.microsoft.com/office/word/2010/wordprocessingCanvas" xmlns:cx="http://schemas.microsoft.com/office/drawing/2014/chartex" xmlns:cx1="http://schemas.microsoft.com/office/drawing/2015/9/8/chartex" xmlns:cx2="http://schemas.microsoft.com/office/drawing/2015/10/21/chartex" xmlns:cx3="http://schemas.microsoft.com/office/drawing/2016/5/9/chartex" xmlns:cx4="http://schemas.microsoft.com/office/drawing/2016/5/10/chartex" xmlns:cx5="http://schemas.microsoft.com/office/drawing/2016/5/11/chartex" xmlns:cx6="http://schemas.microsoft.com/office/drawing/2016/5/12/chartex" xmlns:cx7="http://schemas.microsoft.com/office/drawing/2016/5/13/chartex" xmlns:cx8="http://schemas.microsoft.com/office/drawing/2016/5/14/chartex" xmlns:mc="http://schemas.openxmlformats.org/markup-compatibility/2006" xmlns:aink="http://schemas.microsoft.com/office/drawing/2016/ink" xmlns:am3d="http://schemas.microsoft.com/office/drawing/2017/model3d" xmlns:o="urn:schemas-microsoft-com:office:office" xmlns:oel="http://schemas.microsoft.com/office/2019/extlst" xmlns:r="http://schemas.openxmlformats.org/officeDocument/2006/relationships" xmlns:m="http://schemas.openxmlformats.org/officeDocument/2006/math" xmlns:v="urn:schemas-microsoft-com:vml" xmlns:wp14="http://schemas.microsoft.com/office/word/2010/wordprocessingDrawing" xmlns:wp="http://schemas.openxmlformats.org/drawingml/2006/wordprocessingDrawing" xmlns:w10="urn:schemas-microsoft-com:office:word" xmlns:w="http://schemas.openxmlformats.org/wordprocessingml/2006/main" xmlns:w14="http://schemas.microsoft.com/office/word/2010/wordml" xmlns:w15="http://schemas.microsoft.com/office/word/2012/wordml" xmlns:w16cex="http://schemas.microsoft.com/office/word/2018/wordml/cex" xmlns:w16cid="http://schemas.microsoft.com/office/word/2016/wordml/cid" xmlns:w16="http://schemas.microsoft.com/office/word/2018/wordml" xmlns:w16du="http://schemas.microsoft.com/office/word/2023/wordml/word16du" xmlns:w16sdtdh="http://schemas.microsoft.com/office/word/2020/wordml/sdtdatahash" xmlns:w16sdtfl="http://schemas.microsoft.com/office/word/2024/wordml/sdtformatlock" xmlns:w16se="http://schemas.microsoft.com/office/word/2015/wordml/symex" xmlns:wpg="http://schemas.microsoft.com/office/word/2010/wordprocessingGroup" xmlns:wpi="http://schemas.microsoft.com/office/word/2010/wordprocessingInk" xmlns:wne="http://schemas.microsoft.com/office/word/2006/wordml" xmlns:wps="http://schemas.microsoft.com/office/word/2010/wordprocessingShape" mc:Ignorable="w14 w15 w16se w16cid w16 w16cex w16sdtdh w16sdtfl w16du wp14">
   <w:body>
     <w:p>
       <w:r>
@@ -9,13 +9,8 @@
     </w:p>
     <w:p>
       <w:r>
-        <w:t xml:space="preserve">Aeschlimann Ski Service 4944 </w:t>
-      </w:r>
-      <w:proofErr w:type="spellStart"/>
-      <w:r>
-        <w:t>Auswil</w:t>
-      </w:r>
-      <w:proofErr w:type="spellEnd"/>
+        <w:t>Aeschlimann Ski Service 4944 Auswil</w:t>
+      </w:r>
     </w:p>
     <w:p>
       <w:r>
@@ -29,13 +24,8 @@
     </w:p>
     <w:p>
       <w:r>
-        <w:t xml:space="preserve">Baumann Fred Kunstmaler 3456 </w:t>
-      </w:r>
-      <w:proofErr w:type="spellStart"/>
-      <w:r>
-        <w:t>Dürrenroth</w:t>
-      </w:r>
-      <w:proofErr w:type="spellEnd"/>
+        <w:t>Baumann Fred Kunstmaler 3456 Dürrenroth</w:t>
+      </w:r>
     </w:p>
     <w:p>
       <w:r>
@@ -43,13 +33,8 @@
       </w:r>
     </w:p>
     <w:p>
-      <w:proofErr w:type="spellStart"/>
-      <w:r>
-        <w:t>Bluemigx</w:t>
-      </w:r>
-      <w:proofErr w:type="spellEnd"/>
-      <w:r>
-        <w:t>, Sandra Sommer, 4938 Rohrbachgraben</w:t>
+      <w:r>
+        <w:t>Bluemigx, Sandra Sommer, 4938 Rohrbachgraben</w:t>
       </w:r>
     </w:p>
     <w:p>
@@ -58,57 +43,18 @@
       </w:r>
     </w:p>
     <w:p>
-      <w:proofErr w:type="spellStart"/>
-      <w:r>
-        <w:t>Buri</w:t>
-      </w:r>
-      <w:proofErr w:type="spellEnd"/>
-      <w:r>
-        <w:t xml:space="preserve"> Lohnunternehmen, 4938 Rohrbachgraben</w:t>
-      </w:r>
-    </w:p>
-    <w:p>
-      <w:proofErr w:type="spellStart"/>
-      <w:r>
-        <w:t>Casalife</w:t>
-      </w:r>
-      <w:proofErr w:type="spellEnd"/>
-      <w:r>
-        <w:t xml:space="preserve"> </w:t>
-      </w:r>
-      <w:proofErr w:type="spellStart"/>
-      <w:r>
-        <w:t>Sunnehof</w:t>
-      </w:r>
-      <w:proofErr w:type="spellEnd"/>
-      <w:r>
-        <w:t xml:space="preserve"> AG Seniorenzentrum, 4938 Rohrbach</w:t>
-      </w:r>
-    </w:p>
-    <w:p>
-      <w:proofErr w:type="spellStart"/>
-      <w:r>
-        <w:t>christa</w:t>
-      </w:r>
-      <w:proofErr w:type="spellEnd"/>
-      <w:r>
-        <w:t xml:space="preserve"> minder </w:t>
-      </w:r>
-      <w:proofErr w:type="spellStart"/>
-      <w:r>
-        <w:t>fotografie</w:t>
-      </w:r>
-      <w:proofErr w:type="spellEnd"/>
-      <w:r>
-        <w:t xml:space="preserve"> </w:t>
-      </w:r>
-      <w:proofErr w:type="spellStart"/>
-      <w:r>
-        <w:t>gmbh</w:t>
-      </w:r>
-      <w:proofErr w:type="spellEnd"/>
-      <w:r>
-        <w:t>, 4938 Rohrbach</w:t>
+      <w:r>
+        <w:t>Buri Lohnunternehmen, 4938 Rohrbachgraben</w:t>
+      </w:r>
+    </w:p>
+    <w:p>
+      <w:r>
+        <w:t>Casalife Sunnehof AG Seniorenzentrum, 4938 Rohrbach</w:t>
+      </w:r>
+    </w:p>
+    <w:p>
+      <w:r>
+        <w:t>christa minder fotografie gmbh, 4938 Rohrbach</w:t>
       </w:r>
     </w:p>
     <w:p>
@@ -128,33 +74,12 @@
     </w:p>
     <w:p>
       <w:r>
-        <w:t xml:space="preserve">Dipl. Heilpraktikerin Rosmarie Kleeb, 4944 </w:t>
-      </w:r>
-      <w:proofErr w:type="spellStart"/>
-      <w:r>
-        <w:t>Auswil</w:t>
-      </w:r>
-      <w:proofErr w:type="spellEnd"/>
-    </w:p>
-    <w:p>
-      <w:r>
-        <w:t xml:space="preserve">Elektro </w:t>
-      </w:r>
-      <w:proofErr w:type="spellStart"/>
-      <w:r>
-        <w:t>Wüthrich</w:t>
-      </w:r>
-      <w:proofErr w:type="spellEnd"/>
-      <w:r>
-        <w:t xml:space="preserve"> und </w:t>
-      </w:r>
-      <w:proofErr w:type="spellStart"/>
-      <w:r>
-        <w:t>Flückiger</w:t>
-      </w:r>
-      <w:proofErr w:type="spellEnd"/>
-      <w:r>
-        <w:t xml:space="preserve"> GmbH, 4938 Rohrbach</w:t>
+        <w:t>Dipl. Heilpraktikerin Rosmarie Kleeb, 4944 Auswil</w:t>
+      </w:r>
+    </w:p>
+    <w:p>
+      <w:r>
+        <w:t>Elektro Wüthrich und Flückiger GmbH, 4938 Rohrbach</w:t>
       </w:r>
     </w:p>
     <w:p>
@@ -163,13 +88,8 @@
       </w:r>
     </w:p>
     <w:p>
-      <w:proofErr w:type="spellStart"/>
-      <w:r>
-        <w:t>Flückiger</w:t>
-      </w:r>
-      <w:proofErr w:type="spellEnd"/>
-      <w:r>
-        <w:t xml:space="preserve"> Gebäudetechnik AG Sanitär, Heizung, Spenglerei, 4938 Rohrbach</w:t>
+      <w:r>
+        <w:t>Flückiger Gebäudetechnik AG Sanitär, Heizung, Spenglerei, 4938 Rohrbach</w:t>
       </w:r>
     </w:p>
     <w:p>
@@ -179,13 +99,8 @@
     </w:p>
     <w:p>
       <w:r>
-        <w:t xml:space="preserve">Gertrud Flückiger-Jörg 4944 </w:t>
-      </w:r>
-      <w:proofErr w:type="spellStart"/>
-      <w:r>
-        <w:t>Auswil</w:t>
-      </w:r>
-      <w:proofErr w:type="spellEnd"/>
+        <w:t>Gertrud Flückiger-Jörg 4944 Auswil</w:t>
+      </w:r>
     </w:p>
     <w:p>
       <w:r>
@@ -193,13 +108,8 @@
       </w:r>
     </w:p>
     <w:p>
-      <w:proofErr w:type="spellStart"/>
-      <w:r>
-        <w:t>Gaugesumpfer</w:t>
-      </w:r>
-      <w:proofErr w:type="spellEnd"/>
-      <w:r>
-        <w:t xml:space="preserve"> 4938 Rohrbach</w:t>
+      <w:r>
+        <w:t>Gaugesumpfer 4938 Rohrbach</w:t>
       </w:r>
     </w:p>
     <w:p>
@@ -228,13 +138,8 @@
       </w:r>
     </w:p>
     <w:p>
-      <w:proofErr w:type="spellStart"/>
-      <w:r>
-        <w:t>HansWerk</w:t>
-      </w:r>
-      <w:proofErr w:type="spellEnd"/>
-      <w:r>
-        <w:t xml:space="preserve"> GmbH 4938 Rohrbach</w:t>
+      <w:r>
+        <w:t>HansWerk GmbH 4938 Rohrbach</w:t>
       </w:r>
     </w:p>
     <w:p>
@@ -243,34 +148,13 @@
       </w:r>
     </w:p>
     <w:p>
-      <w:proofErr w:type="spellStart"/>
-      <w:r>
-        <w:t>holzx</w:t>
-      </w:r>
-      <w:proofErr w:type="spellEnd"/>
-      <w:r>
-        <w:t xml:space="preserve"> GmbH, 4938 Rohrbach</w:t>
-      </w:r>
-    </w:p>
-    <w:p>
-      <w:r>
-        <w:t xml:space="preserve">Hundesalon, </w:t>
-      </w:r>
-      <w:proofErr w:type="spellStart"/>
-      <w:r>
-        <w:t>Tanja's</w:t>
-      </w:r>
-      <w:proofErr w:type="spellEnd"/>
-      <w:r>
-        <w:t xml:space="preserve"> 4 </w:t>
-      </w:r>
-      <w:proofErr w:type="spellStart"/>
-      <w:r>
-        <w:t>Pfotensalon</w:t>
-      </w:r>
-      <w:proofErr w:type="spellEnd"/>
-      <w:r>
-        <w:t xml:space="preserve"> &amp; Shop, 4938 Rohrbach</w:t>
+      <w:r>
+        <w:t>holzx GmbH, 4938 Rohrbach</w:t>
+      </w:r>
+    </w:p>
+    <w:p>
+      <w:r>
+        <w:t>Hundesalon, Tanja's 4 Pfotensalon &amp; Shop, 4938 Rohrbach</w:t>
       </w:r>
     </w:p>
     <w:p>
@@ -311,13 +195,8 @@
     </w:p>
     <w:p>
       <w:r>
-        <w:t xml:space="preserve">Massage- u. Reflexzonen Therapie, Veronika Graber-Minder, 4944 </w:t>
-      </w:r>
-      <w:proofErr w:type="spellStart"/>
-      <w:r>
-        <w:t>Auswil</w:t>
-      </w:r>
-      <w:proofErr w:type="spellEnd"/>
+        <w:t>Massage- u. Reflexzonen Therapie, Veronika Graber-Minder, 4944 Auswil</w:t>
+      </w:r>
     </w:p>
     <w:p>
       <w:r>
@@ -336,13 +215,8 @@
     </w:p>
     <w:p>
       <w:r>
-        <w:t xml:space="preserve">Neustart, Strahm Ursula, 4944 </w:t>
-      </w:r>
-      <w:proofErr w:type="spellStart"/>
-      <w:r>
-        <w:t>Auswil</w:t>
-      </w:r>
-      <w:proofErr w:type="spellEnd"/>
+        <w:t>Neustart, Strahm Ursula, 4944 Auswil</w:t>
+      </w:r>
     </w:p>
     <w:p>
       <w:r>
@@ -361,13 +235,8 @@
     </w:p>
     <w:p>
       <w:r>
-        <w:t xml:space="preserve">Rachdi Menel Manuel, Kunstmaler, 4944 </w:t>
-      </w:r>
-      <w:proofErr w:type="spellStart"/>
-      <w:r>
-        <w:t>Auswil</w:t>
-      </w:r>
-      <w:proofErr w:type="spellEnd"/>
+        <w:t>Rachdi Menel Manuel, Kunstmaler, 4944 Auswil</w:t>
+      </w:r>
     </w:p>
     <w:p>
       <w:r>
@@ -375,13 +244,8 @@
       </w:r>
     </w:p>
     <w:p>
-      <w:proofErr w:type="spellStart"/>
-      <w:r>
-        <w:t>Reschtu</w:t>
-      </w:r>
-      <w:proofErr w:type="spellEnd"/>
-      <w:r>
-        <w:t xml:space="preserve"> GmbH, 4938 Rohrbach</w:t>
+      <w:r>
+        <w:t>Reschtu GmbH, 4938 Rohrbach</w:t>
       </w:r>
     </w:p>
     <w:p>
@@ -395,13 +259,8 @@
       </w:r>
     </w:p>
     <w:p>
-      <w:proofErr w:type="spellStart"/>
-      <w:r>
-        <w:t>Roli's</w:t>
-      </w:r>
-      <w:proofErr w:type="spellEnd"/>
-      <w:r>
-        <w:t xml:space="preserve"> Möbelmarkt AG, 4938 Rohrbach</w:t>
+      <w:r>
+        <w:t>Roli's Möbelmarkt AG, 4938 Rohrbach</w:t>
       </w:r>
     </w:p>
     <w:p>
@@ -411,33 +270,12 @@
     </w:p>
     <w:p>
       <w:r>
-        <w:t xml:space="preserve">S. </w:t>
-      </w:r>
-      <w:proofErr w:type="spellStart"/>
-      <w:r>
-        <w:t>Flückiger</w:t>
-      </w:r>
-      <w:proofErr w:type="spellEnd"/>
-      <w:r>
-        <w:t xml:space="preserve"> AG, 4944 </w:t>
-      </w:r>
-      <w:proofErr w:type="spellStart"/>
-      <w:r>
-        <w:t>Auswil</w:t>
-      </w:r>
-      <w:proofErr w:type="spellEnd"/>
-    </w:p>
-    <w:p>
-      <w:r>
-        <w:t xml:space="preserve">Sarah </w:t>
-      </w:r>
-      <w:proofErr w:type="spellStart"/>
-      <w:r>
-        <w:t>Buri</w:t>
-      </w:r>
-      <w:proofErr w:type="spellEnd"/>
-      <w:r>
-        <w:t xml:space="preserve"> Hundesalon Fellart 4938 Rohrbach</w:t>
+        <w:t>S. Flückiger AG, 4944 Auswil</w:t>
+      </w:r>
+    </w:p>
+    <w:p>
+      <w:r>
+        <w:t>Sarah Buri Hundesalon Fellart 4938 Rohrbach</w:t>
       </w:r>
     </w:p>
     <w:p>
@@ -461,23 +299,30 @@
       </w:r>
     </w:p>
     <w:p>
-      <w:proofErr w:type="spellStart"/>
-      <w:r>
-        <w:t>Wärchstück</w:t>
-      </w:r>
-      <w:proofErr w:type="spellEnd"/>
-      <w:r>
-        <w:t xml:space="preserve">, Brigitte Sommer, 4944 </w:t>
-      </w:r>
-      <w:proofErr w:type="spellStart"/>
-      <w:r>
-        <w:t>Auswil</w:t>
-      </w:r>
-      <w:proofErr w:type="spellEnd"/>
+      <w:r>
+        <w:t>Wärchstück, Brigitte Sommer, 4944 Auswil</w:t>
+      </w:r>
     </w:p>
     <w:p>
       <w:r>
         <w:t>Wyssmann Susanne, 4938 Rohrbachgraben</w:t>
+      </w:r>
+    </w:p>
+    <w:p>
+      <w:r>
+        <w:t>Danièle's Hofladen</w:t>
+      </w:r>
+      <w:r>
+        <w:t xml:space="preserve">, </w:t>
+      </w:r>
+      <w:r>
+        <w:t>Hintergasse 7</w:t>
+      </w:r>
+      <w:r>
+        <w:t xml:space="preserve">, </w:t>
+      </w:r>
+      <w:r>
+        <w:t>4938 Rohrbach</w:t>
       </w:r>
     </w:p>
     <w:sectPr>

</xml_diff>